<commit_message>
chore: finalize customer-ready product package docs
- Replace stale customer-facing DOCX wording and em dashes
- Promote Word deliverables and remove superseded Markdown files
- Keep product packages ready for curated ZIP rebuilds
</commit_message>
<xml_diff>
--- a/Email Templates - Free Sample.docx
+++ b/Email Templates - Free Sample.docx
@@ -45,7 +45,7 @@
           <w:color w:val="5F5F5F"/>
           <w:sz w:val="21"/>
         </w:rPr>
-        <w:t>Compliance Audit Email Templates - Free Sample  •  Email Templates - Free Sample.md</w:t>
+        <w:t>Compliance Audit Email Templates - Free Sample  •  Email Templates - Free Sample.docx</w:t>
       </w:r>
     </w:p>
     <w:p>
@@ -3700,7 +3700,7 @@
           <w:color w:val="272727"/>
           <w:sz w:val="22"/>
         </w:rPr>
-        <w:t>Markdown + HTML formats</w:t>
+        <w:t>DOCX + HTML formats</w:t>
       </w:r>
       <w:r>
         <w:rPr>
@@ -3902,7 +3902,7 @@
               <w:color w:val="5F5F5F"/>
               <w:sz w:val="14"/>
             </w:rPr>
-            <w:t>CONTROLSMITH TOOLS.COM  •  SUPPORT@CONTROLSMITH TOOLS.COM</w:t>
+            <w:t>CONTROLSMITHTOOLS.COM  •  SUPPORT@CONTROLSMITHTOOLS.COM</w:t>
           </w:r>
         </w:p>
       </w:tc>

</xml_diff>